<commit_message>
Professional polish: DOCX/XLSX content refined
</commit_message>
<xml_diff>
--- a/pack/AI-Usage-Policy.docx
+++ b/pack/AI-Usage-Policy.docx
@@ -5,9 +5,40 @@
     <w:p>
       <w:pPr>
         <w:pStyle w:val="Title"/>
+        <w:jc w:val="center"/>
       </w:pPr>
       <w:r>
         <w:t>AI Usage Policy</w:t>
+      </w:r>
+    </w:p>
+    <w:p>
+      <w:pPr>
+        <w:jc w:val="center"/>
+      </w:pPr>
+      <w:r>
+        <w:rPr>
+          <w:b/>
+          <w:color w:val="002D72"/>
+          <w:sz w:val="28"/>
+        </w:rPr>
+        <w:t>[YOUR COMPANY NAME]</w:t>
+      </w:r>
+    </w:p>
+    <w:p/>
+    <w:p>
+      <w:r>
+        <w:t>Version 1.0 | Date: [INSERT DATE]</w:t>
+      </w:r>
+    </w:p>
+    <w:p>
+      <w:r>
+        <w:t>Document Owner: [INSERT OWNER NAME]</w:t>
+      </w:r>
+    </w:p>
+    <w:p/>
+    <w:p>
+      <w:r>
+        <w:t>__________________________________________________</w:t>
       </w:r>
     </w:p>
     <w:p>
@@ -20,7 +51,7 @@
     </w:p>
     <w:p>
       <w:r>
-        <w:t>This policy establishes guidelines for the use of Artificial Intelligence (AI) tools within our organization. It ensures that AI use aligns with business objectives, maintains security, and complies with applicable regulations.</w:t>
+        <w:t>This policy establishes guidelines for the use of Artificial Intelligence (AI) tools within our organization.</w:t>
       </w:r>
     </w:p>
     <w:p>
@@ -33,7 +64,7 @@
     </w:p>
     <w:p>
       <w:r>
-        <w:t>This policy applies to all employees, contractors, and team members who use AI tools in their work.</w:t>
+        <w:t>This policy applies to all employees using AI tools for business purposes.</w:t>
       </w:r>
     </w:p>
     <w:p>
@@ -41,37 +72,12 @@
         <w:pStyle w:val="Heading1"/>
       </w:pPr>
       <w:r>
-        <w:t>3. Approved AI Use</w:t>
+        <w:t>3. Approved Use</w:t>
       </w:r>
     </w:p>
     <w:p>
       <w:r>
-        <w:t>The following AI use cases are approved:</w:t>
-      </w:r>
-    </w:p>
-    <w:p>
-      <w:r>
-        <w:t>- Content generation and drafting</w:t>
-      </w:r>
-    </w:p>
-    <w:p>
-      <w:r>
-        <w:t>- Data analysis and insights</w:t>
-      </w:r>
-    </w:p>
-    <w:p>
-      <w:r>
-        <w:t>- Research and summarization</w:t>
-      </w:r>
-    </w:p>
-    <w:p>
-      <w:r>
-        <w:t>- Code assistance</w:t>
-      </w:r>
-    </w:p>
-    <w:p>
-      <w:r>
-        <w:t>- Customer communication support</w:t>
+        <w:t>Content generation, data analysis, research, code assistance, administrative automation.</w:t>
       </w:r>
     </w:p>
     <w:p>
@@ -84,22 +90,7 @@
     </w:p>
     <w:p>
       <w:r>
-        <w:t>The following are not permitted:</w:t>
-      </w:r>
-    </w:p>
-    <w:p>
-      <w:r>
-        <w:t>- Processing sensitive personal data without approval</w:t>
-      </w:r>
-    </w:p>
-    <w:p>
-      <w:r>
-        <w:t>- Making legal or financial decisions without human review</w:t>
-      </w:r>
-    </w:p>
-    <w:p>
-      <w:r>
-        <w:t>- Representing AI output as human-created content without disclosure</w:t>
+        <w:t>Processing sensitive data without approval, legal decisions without review, misrepresenting AI output.</w:t>
       </w:r>
     </w:p>
     <w:p>
@@ -107,12 +98,12 @@
         <w:pStyle w:val="Heading1"/>
       </w:pPr>
       <w:r>
-        <w:t>5. Review and Approval</w:t>
+        <w:t>5. Approval Process</w:t>
       </w:r>
     </w:p>
     <w:p>
       <w:r>
-        <w:t>New AI tools must be approved by [Your Manager Name] before use. Submit requests to [Your IT Contact].</w:t>
+        <w:t>New AI tools: submit request, complete vendor assessment, get manager approval, document in register.</w:t>
       </w:r>
     </w:p>
     <w:p>
@@ -120,22 +111,44 @@
         <w:pStyle w:val="Heading1"/>
       </w:pPr>
       <w:r>
-        <w:t>6. Policy Owner</w:t>
+        <w:t>6. Monitoring</w:t>
       </w:r>
     </w:p>
     <w:p>
       <w:r>
-        <w:t>Policy Owner: [Your Name]</w:t>
+        <w:t>AI use monitored through register. Quarterly compliance reviews.</w:t>
+      </w:r>
+    </w:p>
+    <w:p>
+      <w:pPr>
+        <w:pStyle w:val="Heading1"/>
+      </w:pPr>
+      <w:r>
+        <w:t>7. Review</w:t>
       </w:r>
     </w:p>
     <w:p>
       <w:r>
-        <w:t>Last Updated: [Date]</w:t>
+        <w:t>Annual review or when significant AI landscape changes occur.</w:t>
+      </w:r>
+    </w:p>
+    <w:p>
+      <w:pPr>
+        <w:pStyle w:val="Heading1"/>
+      </w:pPr>
+      <w:r>
+        <w:t>8. Contact</w:t>
       </w:r>
     </w:p>
     <w:p>
       <w:r>
-        <w:t>Next Review: [Date]</w:t>
+        <w:t>Questions: [INSERT EMAIL]</w:t>
+      </w:r>
+    </w:p>
+    <w:p/>
+    <w:p>
+      <w:r>
+        <w:t>Document Control: v1.0 - [DATE] - Initial release</w:t>
       </w:r>
     </w:p>
     <w:sectPr>

</xml_diff>